<commit_message>
added delete.php code validation to test.docx
</commit_message>
<xml_diff>
--- a/a3/test.docx
+++ b/a3/test.docx
@@ -9,6 +9,9 @@
     </w:p>
     <w:p>
       <w:r>
+        <w:rPr>
+          <w:noProof/>
+        </w:rPr>
         <w:drawing>
           <wp:inline distT="0" distB="0" distL="0" distR="0" wp14:anchorId="70A9FC90" wp14:editId="18521E0C">
             <wp:extent cx="5731510" cy="3384550"/>
@@ -47,6 +50,50 @@
       </w:r>
     </w:p>
     <w:p/>
+    <w:p>
+      <w:r>
+        <w:t>Delete.php</w:t>
+      </w:r>
+    </w:p>
+    <w:p>
+      <w:r>
+        <w:drawing>
+          <wp:inline distT="0" distB="0" distL="0" distR="0" wp14:anchorId="3BF6909A" wp14:editId="7C088197">
+            <wp:extent cx="5731510" cy="2837815"/>
+            <wp:effectExtent l="0" t="0" r="2540" b="635"/>
+            <wp:docPr id="2088539051" name="Picture 1"/>
+            <wp:cNvGraphicFramePr>
+              <a:graphicFrameLocks xmlns:a="http://schemas.openxmlformats.org/drawingml/2006/main" noChangeAspect="1"/>
+            </wp:cNvGraphicFramePr>
+            <a:graphic xmlns:a="http://schemas.openxmlformats.org/drawingml/2006/main">
+              <a:graphicData uri="http://schemas.openxmlformats.org/drawingml/2006/picture">
+                <pic:pic xmlns:pic="http://schemas.openxmlformats.org/drawingml/2006/picture">
+                  <pic:nvPicPr>
+                    <pic:cNvPr id="2088539051" name=""/>
+                    <pic:cNvPicPr/>
+                  </pic:nvPicPr>
+                  <pic:blipFill>
+                    <a:blip r:embed="rId5"/>
+                    <a:stretch>
+                      <a:fillRect/>
+                    </a:stretch>
+                  </pic:blipFill>
+                  <pic:spPr>
+                    <a:xfrm>
+                      <a:off x="0" y="0"/>
+                      <a:ext cx="5731510" cy="2837815"/>
+                    </a:xfrm>
+                    <a:prstGeom prst="rect">
+                      <a:avLst/>
+                    </a:prstGeom>
+                  </pic:spPr>
+                </pic:pic>
+              </a:graphicData>
+            </a:graphic>
+          </wp:inline>
+        </w:drawing>
+      </w:r>
+    </w:p>
     <w:p/>
     <w:p>
       <w:r>
@@ -55,6 +102,10 @@
     </w:p>
     <w:p>
       <w:r>
+        <w:rPr>
+          <w:noProof/>
+        </w:rPr>
+        <w:lastRenderedPageBreak/>
         <w:drawing>
           <wp:inline distT="0" distB="0" distL="0" distR="0" wp14:anchorId="1CE6D836" wp14:editId="2B04D7F2">
             <wp:extent cx="5731510" cy="3116580"/>
@@ -71,7 +122,7 @@
                     <pic:cNvPicPr/>
                   </pic:nvPicPr>
                   <pic:blipFill>
-                    <a:blip r:embed="rId5"/>
+                    <a:blip r:embed="rId6"/>
                     <a:stretch>
                       <a:fillRect/>
                     </a:stretch>
@@ -100,7 +151,9 @@
     </w:p>
     <w:p>
       <w:r>
-        <w:lastRenderedPageBreak/>
+        <w:rPr>
+          <w:noProof/>
+        </w:rPr>
         <w:drawing>
           <wp:inline distT="0" distB="0" distL="0" distR="0" wp14:anchorId="7F53723B" wp14:editId="0D95C06F">
             <wp:extent cx="5731510" cy="3359150"/>
@@ -117,7 +170,7 @@
                     <pic:cNvPicPr/>
                   </pic:nvPicPr>
                   <pic:blipFill>
-                    <a:blip r:embed="rId6"/>
+                    <a:blip r:embed="rId7"/>
                     <a:stretch>
                       <a:fillRect/>
                     </a:stretch>
@@ -146,6 +199,10 @@
     </w:p>
     <w:p>
       <w:r>
+        <w:rPr>
+          <w:noProof/>
+        </w:rPr>
+        <w:lastRenderedPageBreak/>
         <w:drawing>
           <wp:inline distT="0" distB="0" distL="0" distR="0" wp14:anchorId="06BD6307" wp14:editId="144BCAC9">
             <wp:extent cx="5731510" cy="2994660"/>
@@ -162,7 +219,7 @@
                     <pic:cNvPicPr/>
                   </pic:nvPicPr>
                   <pic:blipFill>
-                    <a:blip r:embed="rId7"/>
+                    <a:blip r:embed="rId8"/>
                     <a:stretch>
                       <a:fillRect/>
                     </a:stretch>
@@ -190,7 +247,9 @@
     </w:p>
     <w:p>
       <w:r>
-        <w:lastRenderedPageBreak/>
+        <w:rPr>
+          <w:noProof/>
+        </w:rPr>
         <w:drawing>
           <wp:inline distT="0" distB="0" distL="0" distR="0" wp14:anchorId="4FBF5FE7" wp14:editId="10C8F4D4">
             <wp:extent cx="5731510" cy="3252470"/>
@@ -207,7 +266,7 @@
                     <pic:cNvPicPr/>
                   </pic:nvPicPr>
                   <pic:blipFill>
-                    <a:blip r:embed="rId8"/>
+                    <a:blip r:embed="rId9"/>
                     <a:stretch>
                       <a:fillRect/>
                     </a:stretch>
@@ -236,6 +295,10 @@
     </w:p>
     <w:p>
       <w:r>
+        <w:rPr>
+          <w:noProof/>
+        </w:rPr>
+        <w:lastRenderedPageBreak/>
         <w:drawing>
           <wp:inline distT="0" distB="0" distL="0" distR="0" wp14:anchorId="3CEB549C" wp14:editId="476E9460">
             <wp:extent cx="5731510" cy="3194050"/>
@@ -252,7 +315,7 @@
                     <pic:cNvPicPr/>
                   </pic:nvPicPr>
                   <pic:blipFill>
-                    <a:blip r:embed="rId9"/>
+                    <a:blip r:embed="rId10"/>
                     <a:stretch>
                       <a:fillRect/>
                     </a:stretch>
@@ -281,7 +344,9 @@
     </w:p>
     <w:p>
       <w:r>
-        <w:lastRenderedPageBreak/>
+        <w:rPr>
+          <w:noProof/>
+        </w:rPr>
         <w:drawing>
           <wp:inline distT="0" distB="0" distL="0" distR="0" wp14:anchorId="1159599A" wp14:editId="32119494">
             <wp:extent cx="5731510" cy="2967355"/>
@@ -298,7 +363,7 @@
                     <pic:cNvPicPr/>
                   </pic:nvPicPr>
                   <pic:blipFill>
-                    <a:blip r:embed="rId10"/>
+                    <a:blip r:embed="rId11"/>
                     <a:stretch>
                       <a:fillRect/>
                     </a:stretch>
@@ -328,6 +393,10 @@
     </w:p>
     <w:p>
       <w:r>
+        <w:rPr>
+          <w:noProof/>
+        </w:rPr>
+        <w:lastRenderedPageBreak/>
         <w:drawing>
           <wp:inline distT="0" distB="0" distL="0" distR="0" wp14:anchorId="4EF03E77" wp14:editId="71F7EF13">
             <wp:extent cx="5731510" cy="2809240"/>
@@ -344,7 +413,7 @@
                     <pic:cNvPicPr/>
                   </pic:nvPicPr>
                   <pic:blipFill>
-                    <a:blip r:embed="rId11"/>
+                    <a:blip r:embed="rId12"/>
                     <a:stretch>
                       <a:fillRect/>
                     </a:stretch>
@@ -374,7 +443,9 @@
     </w:p>
     <w:p>
       <w:r>
-        <w:lastRenderedPageBreak/>
+        <w:rPr>
+          <w:noProof/>
+        </w:rPr>
         <w:drawing>
           <wp:inline distT="0" distB="0" distL="0" distR="0" wp14:anchorId="57D2613D" wp14:editId="43049CC8">
             <wp:extent cx="5731510" cy="2961005"/>
@@ -391,7 +462,7 @@
                     <pic:cNvPicPr/>
                   </pic:nvPicPr>
                   <pic:blipFill>
-                    <a:blip r:embed="rId12"/>
+                    <a:blip r:embed="rId13"/>
                     <a:stretch>
                       <a:fillRect/>
                     </a:stretch>
@@ -419,6 +490,10 @@
     </w:p>
     <w:p>
       <w:r>
+        <w:rPr>
+          <w:noProof/>
+        </w:rPr>
+        <w:lastRenderedPageBreak/>
         <w:drawing>
           <wp:inline distT="0" distB="0" distL="0" distR="0" wp14:anchorId="2092F545" wp14:editId="758874FF">
             <wp:extent cx="5731510" cy="2962275"/>
@@ -435,7 +510,7 @@
                     <pic:cNvPicPr/>
                   </pic:nvPicPr>
                   <pic:blipFill>
-                    <a:blip r:embed="rId13"/>
+                    <a:blip r:embed="rId14"/>
                     <a:stretch>
                       <a:fillRect/>
                     </a:stretch>
@@ -463,7 +538,9 @@
     </w:p>
     <w:p>
       <w:r>
-        <w:lastRenderedPageBreak/>
+        <w:rPr>
+          <w:noProof/>
+        </w:rPr>
         <w:drawing>
           <wp:inline distT="0" distB="0" distL="0" distR="0" wp14:anchorId="52E93A43" wp14:editId="1C509445">
             <wp:extent cx="5731510" cy="3107055"/>
@@ -480,7 +557,7 @@
                     <pic:cNvPicPr/>
                   </pic:nvPicPr>
                   <pic:blipFill>
-                    <a:blip r:embed="rId14"/>
+                    <a:blip r:embed="rId15"/>
                     <a:stretch>
                       <a:fillRect/>
                     </a:stretch>

</xml_diff>